<commit_message>
Fix grouping leak (mirror/small-angle copies); retrain B0: 77.72% test
- build_dataset.py: group near-duplicates over 8 orientations plus +-3..15 deg
  rotations, pHash or dHash, bidirectional, low-contrast images included
  (audit found 62/368 old-split test images had train copies)
- New split B0 @224: test TTA 77.72% (286/368); patience 8 run stopped early
  at 66.30%, patience raised to 15 (disclosed as post-hoc)
- config: WOOF_PATIENCE (default 15); docs, README and change notes updated
- Docker torch 2.3.1 parity re-run with new weights: 0 mismatches
- B2 comparison remains old-split only

Co-Authored-By: Claude Sonnet 5.5 <noreply@anthropic.com>
</commit_message>
<xml_diff>
--- a/docs/開源平台佐證文件.docx
+++ b/docs/開源平台佐證文件.docx
@@ -17,7 +17,7 @@
     </w:p>
     <w:p>
       <w:r>
-        <w:t>文件日期：2026-10-12（修訂版，補入重新訓練結果，取代 2026-10-10 版）</w:t>
+        <w:t>文件日期：2026-10-12（修訂版，補入重新訓練結果與切分稽核，取代 2026-10-10 版）</w:t>
       </w:r>
     </w:p>
     <w:p>
@@ -1450,6 +1450,373 @@
                 <w:b/>
                 <w:sz w:val="18"/>
               </w:rPr>
+              <w:t>來源</w:t>
+            </w:r>
+          </w:p>
+        </w:tc>
+        <w:tc>
+          <w:tcPr>
+            <w:tcW w:type="dxa" w:w="2160"/>
+          </w:tcPr>
+          <w:p>
+            <w:r>
+              <w:rPr>
+                <w:b/>
+                <w:sz w:val="18"/>
+              </w:rPr>
+              <w:t>train</w:t>
+            </w:r>
+          </w:p>
+        </w:tc>
+        <w:tc>
+          <w:tcPr>
+            <w:tcW w:type="dxa" w:w="2160"/>
+          </w:tcPr>
+          <w:p>
+            <w:r>
+              <w:rPr>
+                <w:b/>
+                <w:sz w:val="18"/>
+              </w:rPr>
+              <w:t>val</w:t>
+            </w:r>
+          </w:p>
+        </w:tc>
+        <w:tc>
+          <w:tcPr>
+            <w:tcW w:type="dxa" w:w="2160"/>
+          </w:tcPr>
+          <w:p>
+            <w:r>
+              <w:rPr>
+                <w:b/>
+                <w:sz w:val="18"/>
+              </w:rPr>
+              <w:t>test</w:t>
+            </w:r>
+          </w:p>
+        </w:tc>
+      </w:tr>
+      <w:tr>
+        <w:tc>
+          <w:tcPr>
+            <w:tcW w:type="dxa" w:w="2160"/>
+          </w:tcPr>
+          <w:p>
+            <w:r>
+              <w:rPr>
+                <w:b w:val="0"/>
+                <w:sz w:val="18"/>
+              </w:rPr>
+              <w:t>gabungan</w:t>
+            </w:r>
+          </w:p>
+        </w:tc>
+        <w:tc>
+          <w:tcPr>
+            <w:tcW w:type="dxa" w:w="2160"/>
+          </w:tcPr>
+          <w:p>
+            <w:r>
+              <w:rPr>
+                <w:b w:val="0"/>
+                <w:sz w:val="18"/>
+              </w:rPr>
+              <w:t>1,601</w:t>
+            </w:r>
+          </w:p>
+        </w:tc>
+        <w:tc>
+          <w:tcPr>
+            <w:tcW w:type="dxa" w:w="2160"/>
+          </w:tcPr>
+          <w:p>
+            <w:r>
+              <w:rPr>
+                <w:b w:val="0"/>
+                <w:sz w:val="18"/>
+              </w:rPr>
+              <w:t>237</w:t>
+            </w:r>
+          </w:p>
+        </w:tc>
+        <w:tc>
+          <w:tcPr>
+            <w:tcW w:type="dxa" w:w="2160"/>
+          </w:tcPr>
+          <w:p>
+            <w:r>
+              <w:rPr>
+                <w:b w:val="0"/>
+                <w:sz w:val="18"/>
+              </w:rPr>
+              <w:t>166</w:t>
+            </w:r>
+          </w:p>
+        </w:tc>
+      </w:tr>
+      <w:tr>
+        <w:tc>
+          <w:tcPr>
+            <w:tcW w:type="dxa" w:w="2160"/>
+          </w:tcPr>
+          <w:p>
+            <w:r>
+              <w:rPr>
+                <w:b w:val="0"/>
+                <w:sz w:val="18"/>
+              </w:rPr>
+              <w:t>litespy</w:t>
+            </w:r>
+          </w:p>
+        </w:tc>
+        <w:tc>
+          <w:tcPr>
+            <w:tcW w:type="dxa" w:w="2160"/>
+          </w:tcPr>
+          <w:p>
+            <w:r>
+              <w:rPr>
+                <w:b w:val="0"/>
+                <w:sz w:val="18"/>
+              </w:rPr>
+              <w:t>1,161</w:t>
+            </w:r>
+          </w:p>
+        </w:tc>
+        <w:tc>
+          <w:tcPr>
+            <w:tcW w:type="dxa" w:w="2160"/>
+          </w:tcPr>
+          <w:p>
+            <w:r>
+              <w:rPr>
+                <w:b w:val="0"/>
+                <w:sz w:val="18"/>
+              </w:rPr>
+              <w:t>73</w:t>
+            </w:r>
+          </w:p>
+        </w:tc>
+        <w:tc>
+          <w:tcPr>
+            <w:tcW w:type="dxa" w:w="2160"/>
+          </w:tcPr>
+          <w:p>
+            <w:r>
+              <w:rPr>
+                <w:b w:val="0"/>
+                <w:sz w:val="18"/>
+              </w:rPr>
+              <w:t>40</w:t>
+            </w:r>
+          </w:p>
+        </w:tc>
+      </w:tr>
+      <w:tr>
+        <w:tc>
+          <w:tcPr>
+            <w:tcW w:type="dxa" w:w="2160"/>
+          </w:tcPr>
+          <w:p>
+            <w:r>
+              <w:rPr>
+                <w:b w:val="0"/>
+                <w:sz w:val="18"/>
+              </w:rPr>
+              <w:t>smartdog</w:t>
+            </w:r>
+          </w:p>
+        </w:tc>
+        <w:tc>
+          <w:tcPr>
+            <w:tcW w:type="dxa" w:w="2160"/>
+          </w:tcPr>
+          <w:p>
+            <w:r>
+              <w:rPr>
+                <w:b w:val="0"/>
+                <w:sz w:val="18"/>
+              </w:rPr>
+              <w:t>872</w:t>
+            </w:r>
+          </w:p>
+        </w:tc>
+        <w:tc>
+          <w:tcPr>
+            <w:tcW w:type="dxa" w:w="2160"/>
+          </w:tcPr>
+          <w:p>
+            <w:r>
+              <w:rPr>
+                <w:b w:val="0"/>
+                <w:sz w:val="18"/>
+              </w:rPr>
+              <w:t>160</w:t>
+            </w:r>
+          </w:p>
+        </w:tc>
+        <w:tc>
+          <w:tcPr>
+            <w:tcW w:type="dxa" w:w="2160"/>
+          </w:tcPr>
+          <w:p>
+            <w:r>
+              <w:rPr>
+                <w:b w:val="0"/>
+                <w:sz w:val="18"/>
+              </w:rPr>
+              <w:t>148</w:t>
+            </w:r>
+          </w:p>
+        </w:tc>
+      </w:tr>
+      <w:tr>
+        <w:tc>
+          <w:tcPr>
+            <w:tcW w:type="dxa" w:w="2160"/>
+          </w:tcPr>
+          <w:p>
+            <w:r>
+              <w:rPr>
+                <w:b w:val="0"/>
+                <w:sz w:val="18"/>
+              </w:rPr>
+              <w:t>smoky</w:t>
+            </w:r>
+          </w:p>
+        </w:tc>
+        <w:tc>
+          <w:tcPr>
+            <w:tcW w:type="dxa" w:w="2160"/>
+          </w:tcPr>
+          <w:p>
+            <w:r>
+              <w:rPr>
+                <w:b w:val="0"/>
+                <w:sz w:val="18"/>
+              </w:rPr>
+              <w:t>246</w:t>
+            </w:r>
+          </w:p>
+        </w:tc>
+        <w:tc>
+          <w:tcPr>
+            <w:tcW w:type="dxa" w:w="2160"/>
+          </w:tcPr>
+          <w:p>
+            <w:r>
+              <w:rPr>
+                <w:b w:val="0"/>
+                <w:sz w:val="18"/>
+              </w:rPr>
+              <w:t>18</w:t>
+            </w:r>
+          </w:p>
+        </w:tc>
+        <w:tc>
+          <w:tcPr>
+            <w:tcW w:type="dxa" w:w="2160"/>
+          </w:tcPr>
+          <w:p>
+            <w:r>
+              <w:rPr>
+                <w:b w:val="0"/>
+                <w:sz w:val="18"/>
+              </w:rPr>
+              <w:t>14</w:t>
+            </w:r>
+          </w:p>
+        </w:tc>
+      </w:tr>
+      <w:tr>
+        <w:tc>
+          <w:tcPr>
+            <w:tcW w:type="dxa" w:w="2160"/>
+          </w:tcPr>
+          <w:p>
+            <w:r>
+              <w:rPr>
+                <w:b w:val="0"/>
+                <w:sz w:val="18"/>
+              </w:rPr>
+              <w:t>合計</w:t>
+            </w:r>
+          </w:p>
+        </w:tc>
+        <w:tc>
+          <w:tcPr>
+            <w:tcW w:type="dxa" w:w="2160"/>
+          </w:tcPr>
+          <w:p>
+            <w:r>
+              <w:rPr>
+                <w:b w:val="0"/>
+                <w:sz w:val="18"/>
+              </w:rPr>
+              <w:t>3,880</w:t>
+            </w:r>
+          </w:p>
+        </w:tc>
+        <w:tc>
+          <w:tcPr>
+            <w:tcW w:type="dxa" w:w="2160"/>
+          </w:tcPr>
+          <w:p>
+            <w:r>
+              <w:rPr>
+                <w:b w:val="0"/>
+                <w:sz w:val="18"/>
+              </w:rPr>
+              <w:t>488</w:t>
+            </w:r>
+          </w:p>
+        </w:tc>
+        <w:tc>
+          <w:tcPr>
+            <w:tcW w:type="dxa" w:w="2160"/>
+          </w:tcPr>
+          <w:p>
+            <w:r>
+              <w:rPr>
+                <w:b w:val="0"/>
+                <w:sz w:val="18"/>
+              </w:rPr>
+              <w:t>368</w:t>
+            </w:r>
+          </w:p>
+        </w:tc>
+      </w:tr>
+    </w:tbl>
+    <w:p/>
+    <w:p>
+      <w:r>
+        <w:t>分組後有一個 1,098 張的巨大群組（幾乎都是 litespy 近單色影像，1,068 張，橫跨 4 個類別），全部落在 train；這可能是低對比度影像互相鏈結造成的過度合併，使各來源在 val/test 的比例與整體不同。</w:t>
+      </w:r>
+    </w:p>
+    <w:tbl>
+      <w:tblPr>
+        <w:tblStyle w:val="TableGrid"/>
+        <w:tblW w:type="auto" w:w="0"/>
+        <w:tblLook w:firstColumn="1" w:firstRow="1" w:lastColumn="0" w:lastRow="0" w:noHBand="0" w:noVBand="1" w:val="04A0"/>
+      </w:tblPr>
+      <w:tblGrid>
+        <w:gridCol w:w="2160"/>
+        <w:gridCol w:w="2160"/>
+        <w:gridCol w:w="2160"/>
+        <w:gridCol w:w="2160"/>
+      </w:tblGrid>
+      <w:tr>
+        <w:tc>
+          <w:tcPr>
+            <w:tcW w:type="dxa" w:w="2160"/>
+          </w:tcPr>
+          <w:p>
+            <w:r>
+              <w:rPr>
+                <w:b/>
+                <w:sz w:val="18"/>
+              </w:rPr>
               <w:t>類別</w:t>
             </w:r>
           </w:p>
@@ -2218,7 +2585,7 @@
         <w:pStyle w:val="ListBullet"/>
       </w:pPr>
       <w:r>
-        <w:t>同一來源影像檔的多個裁切、描述性檔名相同者、近似重複者視為同一群組，整組分入同一個 split（含旋轉 90/180/270 度比對），各類別依比例分層，避免訓練／測試洩漏。</w:t>
+        <w:t>同一來源影像檔的多個裁切、描述性檔名相同者、近似重複者視為同一群組，整組分入同一個 split，各類別依比例分層，避免訓練／測試洩漏。分組比對涵蓋 8 種方向（旋轉 90 度倍數與水平鏡像）及 ±3/5/7/10/15° 小角度旋轉，pHash 或 dHash 任一近似（距離 ≤ 8）且 32×32 灰階相關係數 ≥ 0.9 即視為同組，雙向比對，低對比度影像也參與分組。（先前版本只比對 0/90/180/270 度，稽核發現測試集有 62/368＝16.8% 在訓練集有鏡像或小角度旋轉的近重複副本，故改版；舊切分的 80.16% 不再作為主要結果。）</w:t>
       </w:r>
     </w:p>
     <w:p>
@@ -2266,6 +2633,14 @@
         <w:pStyle w:val="ListBullet"/>
       </w:pPr>
       <w:r>
+        <w:t>新切分的巨大群組（見上）使 litespy 與 smoky 的 val/test 筆數很少（litespy 測試 40、smoky 測試 14），來源別準確率不穩定。</w:t>
+      </w:r>
+    </w:p>
+    <w:p>
+      <w:pPr>
+        <w:pStyle w:val="ListBullet"/>
+      </w:pPr>
+      <w:r>
         <w:t>資料集規模（4,736 筆）小於先前版本，且各來源之類別與影像類型混淆，模型表現不宜歸因於影像類型。</w:t>
       </w:r>
     </w:p>
@@ -2679,7 +3054,7 @@
         <w:pStyle w:val="ListBullet"/>
       </w:pPr>
       <w:r>
-        <w:t>抗過擬合：Label smoothing 0.1、Focal Loss（γ=2，類別權重）、WeightedRandomSampler、MixUp(α0.2) / CutMix(α1.0)（機率 0.5）、前 5 epoch 凍結骨幹、early stopping（監控驗證 loss）；依驗證集 weighted F1 選模型</w:t>
+        <w:t>抗過擬合：Label smoothing 0.1、Focal Loss（γ=2，類別權重）、WeightedRandomSampler、MixUp(α0.2) / CutMix(α1.0)（機率 0.5）、前 5 epoch 凍結骨幹、early stopping（監控驗證 loss，patience 15，可用 WOOF_PATIENCE 覆寫）；依驗證集 weighted F1 選模型</w:t>
       </w:r>
     </w:p>
     <w:p>
@@ -2703,12 +3078,12 @@
         <w:pStyle w:val="Heading2"/>
       </w:pPr>
       <w:r>
-        <w:t>訓練與測試結果（本資料集、來源群組切分、測試集 368 筆從未參與訓練或選模型）</w:t>
+        <w:t>訓練與測試結果（新切分；測試集 368 筆從未參與訓練或選模型）</w:t>
       </w:r>
     </w:p>
     <w:p>
       <w:r>
-        <w:t>主模型為 EfficientNet-B0 @224（以驗證 weighted F1 選出 epoch 35，epoch 41 early stopping）。</w:t>
+        <w:t>主模型為 EfficientNet-B0 @224，依驗證 weighted F1 選出 epoch 38，epoch 53 early stopping（patience 15）。</w:t>
       </w:r>
     </w:p>
     <w:tbl>
@@ -2774,6 +3149,1025 @@
             <w:r>
               <w:rPr>
                 <w:b w:val="0"/>
+                <w:sz w:val="18"/>
+              </w:rPr>
+              <w:t>77.72%（286/368）</w:t>
+            </w:r>
+          </w:p>
+        </w:tc>
+      </w:tr>
+      <w:tr>
+        <w:tc>
+          <w:tcPr>
+            <w:tcW w:type="dxa" w:w="4320"/>
+          </w:tcPr>
+          <w:p>
+            <w:r>
+              <w:rPr>
+                <w:b w:val="0"/>
+                <w:sz w:val="18"/>
+              </w:rPr>
+              <w:t>macro precision / recall / F1</w:t>
+            </w:r>
+          </w:p>
+        </w:tc>
+        <w:tc>
+          <w:tcPr>
+            <w:tcW w:type="dxa" w:w="4320"/>
+          </w:tcPr>
+          <w:p>
+            <w:r>
+              <w:rPr>
+                <w:b w:val="0"/>
+                <w:sz w:val="18"/>
+              </w:rPr>
+              <w:t>0.775 / 0.775 / 0.7731</w:t>
+            </w:r>
+          </w:p>
+        </w:tc>
+      </w:tr>
+      <w:tr>
+        <w:tc>
+          <w:tcPr>
+            <w:tcW w:type="dxa" w:w="4320"/>
+          </w:tcPr>
+          <w:p>
+            <w:r>
+              <w:rPr>
+                <w:b w:val="0"/>
+                <w:sz w:val="18"/>
+              </w:rPr>
+              <w:t>weighted F1</w:t>
+            </w:r>
+          </w:p>
+        </w:tc>
+        <w:tc>
+          <w:tcPr>
+            <w:tcW w:type="dxa" w:w="4320"/>
+          </w:tcPr>
+          <w:p>
+            <w:r>
+              <w:rPr>
+                <w:b w:val="0"/>
+                <w:sz w:val="18"/>
+              </w:rPr>
+              <w:t>0.7781</w:t>
+            </w:r>
+          </w:p>
+        </w:tc>
+      </w:tr>
+      <w:tr>
+        <w:tc>
+          <w:tcPr>
+            <w:tcW w:type="dxa" w:w="4320"/>
+          </w:tcPr>
+          <w:p>
+            <w:r>
+              <w:rPr>
+                <w:b w:val="0"/>
+                <w:sz w:val="18"/>
+              </w:rPr>
+              <w:t>驗證 Accuracy</w:t>
+            </w:r>
+          </w:p>
+        </w:tc>
+        <w:tc>
+          <w:tcPr>
+            <w:tcW w:type="dxa" w:w="4320"/>
+          </w:tcPr>
+          <w:p>
+            <w:r>
+              <w:rPr>
+                <w:b w:val="0"/>
+                <w:sz w:val="18"/>
+              </w:rPr>
+              <w:t>75.61%（最佳 val F1 0.7595）</w:t>
+            </w:r>
+          </w:p>
+        </w:tc>
+      </w:tr>
+    </w:tbl>
+    <w:p/>
+    <w:tbl>
+      <w:tblPr>
+        <w:tblStyle w:val="TableGrid"/>
+        <w:tblW w:type="auto" w:w="0"/>
+        <w:tblLook w:firstColumn="1" w:firstRow="1" w:lastColumn="0" w:lastRow="0" w:noHBand="0" w:noVBand="1" w:val="04A0"/>
+      </w:tblPr>
+      <w:tblGrid>
+        <w:gridCol w:w="1728"/>
+        <w:gridCol w:w="1728"/>
+        <w:gridCol w:w="1728"/>
+        <w:gridCol w:w="1728"/>
+        <w:gridCol w:w="1728"/>
+      </w:tblGrid>
+      <w:tr>
+        <w:tc>
+          <w:tcPr>
+            <w:tcW w:type="dxa" w:w="1728"/>
+          </w:tcPr>
+          <w:p>
+            <w:r>
+              <w:rPr>
+                <w:b/>
+                <w:sz w:val="18"/>
+              </w:rPr>
+              <w:t>類別</w:t>
+            </w:r>
+          </w:p>
+        </w:tc>
+        <w:tc>
+          <w:tcPr>
+            <w:tcW w:type="dxa" w:w="1728"/>
+          </w:tcPr>
+          <w:p>
+            <w:r>
+              <w:rPr>
+                <w:b/>
+                <w:sz w:val="18"/>
+              </w:rPr>
+              <w:t>Precision</w:t>
+            </w:r>
+          </w:p>
+        </w:tc>
+        <w:tc>
+          <w:tcPr>
+            <w:tcW w:type="dxa" w:w="1728"/>
+          </w:tcPr>
+          <w:p>
+            <w:r>
+              <w:rPr>
+                <w:b/>
+                <w:sz w:val="18"/>
+              </w:rPr>
+              <w:t>Recall（靈敏度）</w:t>
+            </w:r>
+          </w:p>
+        </w:tc>
+        <w:tc>
+          <w:tcPr>
+            <w:tcW w:type="dxa" w:w="1728"/>
+          </w:tcPr>
+          <w:p>
+            <w:r>
+              <w:rPr>
+                <w:b/>
+                <w:sz w:val="18"/>
+              </w:rPr>
+              <w:t>F1</w:t>
+            </w:r>
+          </w:p>
+        </w:tc>
+        <w:tc>
+          <w:tcPr>
+            <w:tcW w:type="dxa" w:w="1728"/>
+          </w:tcPr>
+          <w:p>
+            <w:r>
+              <w:rPr>
+                <w:b/>
+                <w:sz w:val="18"/>
+              </w:rPr>
+              <w:t>測試筆數</w:t>
+            </w:r>
+          </w:p>
+        </w:tc>
+      </w:tr>
+      <w:tr>
+        <w:tc>
+          <w:tcPr>
+            <w:tcW w:type="dxa" w:w="1728"/>
+          </w:tcPr>
+          <w:p>
+            <w:r>
+              <w:rPr>
+                <w:b w:val="0"/>
+                <w:sz w:val="18"/>
+              </w:rPr>
+              <w:t>bacterial_dermatosis</w:t>
+            </w:r>
+          </w:p>
+        </w:tc>
+        <w:tc>
+          <w:tcPr>
+            <w:tcW w:type="dxa" w:w="1728"/>
+          </w:tcPr>
+          <w:p>
+            <w:r>
+              <w:rPr>
+                <w:b w:val="0"/>
+                <w:sz w:val="18"/>
+              </w:rPr>
+              <w:t>0.750</w:t>
+            </w:r>
+          </w:p>
+        </w:tc>
+        <w:tc>
+          <w:tcPr>
+            <w:tcW w:type="dxa" w:w="1728"/>
+          </w:tcPr>
+          <w:p>
+            <w:r>
+              <w:rPr>
+                <w:b w:val="0"/>
+                <w:sz w:val="18"/>
+              </w:rPr>
+              <w:t>0.736</w:t>
+            </w:r>
+          </w:p>
+        </w:tc>
+        <w:tc>
+          <w:tcPr>
+            <w:tcW w:type="dxa" w:w="1728"/>
+          </w:tcPr>
+          <w:p>
+            <w:r>
+              <w:rPr>
+                <w:b w:val="0"/>
+                <w:sz w:val="18"/>
+              </w:rPr>
+              <w:t>0.743</w:t>
+            </w:r>
+          </w:p>
+        </w:tc>
+        <w:tc>
+          <w:tcPr>
+            <w:tcW w:type="dxa" w:w="1728"/>
+          </w:tcPr>
+          <w:p>
+            <w:r>
+              <w:rPr>
+                <w:b w:val="0"/>
+                <w:sz w:val="18"/>
+              </w:rPr>
+              <w:t>53</w:t>
+            </w:r>
+          </w:p>
+        </w:tc>
+      </w:tr>
+      <w:tr>
+        <w:tc>
+          <w:tcPr>
+            <w:tcW w:type="dxa" w:w="1728"/>
+          </w:tcPr>
+          <w:p>
+            <w:r>
+              <w:rPr>
+                <w:b w:val="0"/>
+                <w:sz w:val="18"/>
+              </w:rPr>
+              <w:t>dermatitis</w:t>
+            </w:r>
+          </w:p>
+        </w:tc>
+        <w:tc>
+          <w:tcPr>
+            <w:tcW w:type="dxa" w:w="1728"/>
+          </w:tcPr>
+          <w:p>
+            <w:r>
+              <w:rPr>
+                <w:b w:val="0"/>
+                <w:sz w:val="18"/>
+              </w:rPr>
+              <w:t>0.742</w:t>
+            </w:r>
+          </w:p>
+        </w:tc>
+        <w:tc>
+          <w:tcPr>
+            <w:tcW w:type="dxa" w:w="1728"/>
+          </w:tcPr>
+          <w:p>
+            <w:r>
+              <w:rPr>
+                <w:b w:val="0"/>
+                <w:sz w:val="18"/>
+              </w:rPr>
+              <w:t>0.780</w:t>
+            </w:r>
+          </w:p>
+        </w:tc>
+        <w:tc>
+          <w:tcPr>
+            <w:tcW w:type="dxa" w:w="1728"/>
+          </w:tcPr>
+          <w:p>
+            <w:r>
+              <w:rPr>
+                <w:b w:val="0"/>
+                <w:sz w:val="18"/>
+              </w:rPr>
+              <w:t>0.760</w:t>
+            </w:r>
+          </w:p>
+        </w:tc>
+        <w:tc>
+          <w:tcPr>
+            <w:tcW w:type="dxa" w:w="1728"/>
+          </w:tcPr>
+          <w:p>
+            <w:r>
+              <w:rPr>
+                <w:b w:val="0"/>
+                <w:sz w:val="18"/>
+              </w:rPr>
+              <w:t>59</w:t>
+            </w:r>
+          </w:p>
+        </w:tc>
+      </w:tr>
+      <w:tr>
+        <w:tc>
+          <w:tcPr>
+            <w:tcW w:type="dxa" w:w="1728"/>
+          </w:tcPr>
+          <w:p>
+            <w:r>
+              <w:rPr>
+                <w:b w:val="0"/>
+                <w:sz w:val="18"/>
+              </w:rPr>
+              <w:t>dermatophytosis</w:t>
+            </w:r>
+          </w:p>
+        </w:tc>
+        <w:tc>
+          <w:tcPr>
+            <w:tcW w:type="dxa" w:w="1728"/>
+          </w:tcPr>
+          <w:p>
+            <w:r>
+              <w:rPr>
+                <w:b w:val="0"/>
+                <w:sz w:val="18"/>
+              </w:rPr>
+              <w:t>0.678</w:t>
+            </w:r>
+          </w:p>
+        </w:tc>
+        <w:tc>
+          <w:tcPr>
+            <w:tcW w:type="dxa" w:w="1728"/>
+          </w:tcPr>
+          <w:p>
+            <w:r>
+              <w:rPr>
+                <w:b w:val="0"/>
+                <w:sz w:val="18"/>
+              </w:rPr>
+              <w:t>0.714</w:t>
+            </w:r>
+          </w:p>
+        </w:tc>
+        <w:tc>
+          <w:tcPr>
+            <w:tcW w:type="dxa" w:w="1728"/>
+          </w:tcPr>
+          <w:p>
+            <w:r>
+              <w:rPr>
+                <w:b w:val="0"/>
+                <w:sz w:val="18"/>
+              </w:rPr>
+              <w:t>0.696</w:t>
+            </w:r>
+          </w:p>
+        </w:tc>
+        <w:tc>
+          <w:tcPr>
+            <w:tcW w:type="dxa" w:w="1728"/>
+          </w:tcPr>
+          <w:p>
+            <w:r>
+              <w:rPr>
+                <w:b w:val="0"/>
+                <w:sz w:val="18"/>
+              </w:rPr>
+              <w:t>56</w:t>
+            </w:r>
+          </w:p>
+        </w:tc>
+      </w:tr>
+      <w:tr>
+        <w:tc>
+          <w:tcPr>
+            <w:tcW w:type="dxa" w:w="1728"/>
+          </w:tcPr>
+          <w:p>
+            <w:r>
+              <w:rPr>
+                <w:b w:val="0"/>
+                <w:sz w:val="18"/>
+              </w:rPr>
+              <w:t>flea_allergy_dermatitis</w:t>
+            </w:r>
+          </w:p>
+        </w:tc>
+        <w:tc>
+          <w:tcPr>
+            <w:tcW w:type="dxa" w:w="1728"/>
+          </w:tcPr>
+          <w:p>
+            <w:r>
+              <w:rPr>
+                <w:b w:val="0"/>
+                <w:sz w:val="18"/>
+              </w:rPr>
+              <w:t>0.727</w:t>
+            </w:r>
+          </w:p>
+        </w:tc>
+        <w:tc>
+          <w:tcPr>
+            <w:tcW w:type="dxa" w:w="1728"/>
+          </w:tcPr>
+          <w:p>
+            <w:r>
+              <w:rPr>
+                <w:b w:val="0"/>
+                <w:sz w:val="18"/>
+              </w:rPr>
+              <w:t>0.816</w:t>
+            </w:r>
+          </w:p>
+        </w:tc>
+        <w:tc>
+          <w:tcPr>
+            <w:tcW w:type="dxa" w:w="1728"/>
+          </w:tcPr>
+          <w:p>
+            <w:r>
+              <w:rPr>
+                <w:b w:val="0"/>
+                <w:sz w:val="18"/>
+              </w:rPr>
+              <w:t>0.769</w:t>
+            </w:r>
+          </w:p>
+        </w:tc>
+        <w:tc>
+          <w:tcPr>
+            <w:tcW w:type="dxa" w:w="1728"/>
+          </w:tcPr>
+          <w:p>
+            <w:r>
+              <w:rPr>
+                <w:b w:val="0"/>
+                <w:sz w:val="18"/>
+              </w:rPr>
+              <w:t>49</w:t>
+            </w:r>
+          </w:p>
+        </w:tc>
+      </w:tr>
+      <w:tr>
+        <w:tc>
+          <w:tcPr>
+            <w:tcW w:type="dxa" w:w="1728"/>
+          </w:tcPr>
+          <w:p>
+            <w:r>
+              <w:rPr>
+                <w:b w:val="0"/>
+                <w:sz w:val="18"/>
+              </w:rPr>
+              <w:t>healthy</w:t>
+            </w:r>
+          </w:p>
+        </w:tc>
+        <w:tc>
+          <w:tcPr>
+            <w:tcW w:type="dxa" w:w="1728"/>
+          </w:tcPr>
+          <w:p>
+            <w:r>
+              <w:rPr>
+                <w:b w:val="0"/>
+                <w:sz w:val="18"/>
+              </w:rPr>
+              <w:t>0.952</w:t>
+            </w:r>
+          </w:p>
+        </w:tc>
+        <w:tc>
+          <w:tcPr>
+            <w:tcW w:type="dxa" w:w="1728"/>
+          </w:tcPr>
+          <w:p>
+            <w:r>
+              <w:rPr>
+                <w:b w:val="0"/>
+                <w:sz w:val="18"/>
+              </w:rPr>
+              <w:t>0.822</w:t>
+            </w:r>
+          </w:p>
+        </w:tc>
+        <w:tc>
+          <w:tcPr>
+            <w:tcW w:type="dxa" w:w="1728"/>
+          </w:tcPr>
+          <w:p>
+            <w:r>
+              <w:rPr>
+                <w:b w:val="0"/>
+                <w:sz w:val="18"/>
+              </w:rPr>
+              <w:t>0.882</w:t>
+            </w:r>
+          </w:p>
+        </w:tc>
+        <w:tc>
+          <w:tcPr>
+            <w:tcW w:type="dxa" w:w="1728"/>
+          </w:tcPr>
+          <w:p>
+            <w:r>
+              <w:rPr>
+                <w:b w:val="0"/>
+                <w:sz w:val="18"/>
+              </w:rPr>
+              <w:t>73</w:t>
+            </w:r>
+          </w:p>
+        </w:tc>
+      </w:tr>
+      <w:tr>
+        <w:tc>
+          <w:tcPr>
+            <w:tcW w:type="dxa" w:w="1728"/>
+          </w:tcPr>
+          <w:p>
+            <w:r>
+              <w:rPr>
+                <w:b w:val="0"/>
+                <w:sz w:val="18"/>
+              </w:rPr>
+              <w:t>hypersensitivity_dermatitis</w:t>
+            </w:r>
+          </w:p>
+        </w:tc>
+        <w:tc>
+          <w:tcPr>
+            <w:tcW w:type="dxa" w:w="1728"/>
+          </w:tcPr>
+          <w:p>
+            <w:r>
+              <w:rPr>
+                <w:b w:val="0"/>
+                <w:sz w:val="18"/>
+              </w:rPr>
+              <w:t>0.818</w:t>
+            </w:r>
+          </w:p>
+        </w:tc>
+        <w:tc>
+          <w:tcPr>
+            <w:tcW w:type="dxa" w:w="1728"/>
+          </w:tcPr>
+          <w:p>
+            <w:r>
+              <w:rPr>
+                <w:b w:val="0"/>
+                <w:sz w:val="18"/>
+              </w:rPr>
+              <w:t>0.900</w:t>
+            </w:r>
+          </w:p>
+        </w:tc>
+        <w:tc>
+          <w:tcPr>
+            <w:tcW w:type="dxa" w:w="1728"/>
+          </w:tcPr>
+          <w:p>
+            <w:r>
+              <w:rPr>
+                <w:b w:val="0"/>
+                <w:sz w:val="18"/>
+              </w:rPr>
+              <w:t>0.857</w:t>
+            </w:r>
+          </w:p>
+        </w:tc>
+        <w:tc>
+          <w:tcPr>
+            <w:tcW w:type="dxa" w:w="1728"/>
+          </w:tcPr>
+          <w:p>
+            <w:r>
+              <w:rPr>
+                <w:b w:val="0"/>
+                <w:sz w:val="18"/>
+              </w:rPr>
+              <w:t>40</w:t>
+            </w:r>
+          </w:p>
+        </w:tc>
+      </w:tr>
+      <w:tr>
+        <w:tc>
+          <w:tcPr>
+            <w:tcW w:type="dxa" w:w="1728"/>
+          </w:tcPr>
+          <w:p>
+            <w:r>
+              <w:rPr>
+                <w:b w:val="0"/>
+                <w:sz w:val="18"/>
+              </w:rPr>
+              <w:t>mange</w:t>
+            </w:r>
+          </w:p>
+        </w:tc>
+        <w:tc>
+          <w:tcPr>
+            <w:tcW w:type="dxa" w:w="1728"/>
+          </w:tcPr>
+          <w:p>
+            <w:r>
+              <w:rPr>
+                <w:b w:val="0"/>
+                <w:sz w:val="18"/>
+              </w:rPr>
+              <w:t>0.758</w:t>
+            </w:r>
+          </w:p>
+        </w:tc>
+        <w:tc>
+          <w:tcPr>
+            <w:tcW w:type="dxa" w:w="1728"/>
+          </w:tcPr>
+          <w:p>
+            <w:r>
+              <w:rPr>
+                <w:b w:val="0"/>
+                <w:sz w:val="18"/>
+              </w:rPr>
+              <w:t>0.658</w:t>
+            </w:r>
+          </w:p>
+        </w:tc>
+        <w:tc>
+          <w:tcPr>
+            <w:tcW w:type="dxa" w:w="1728"/>
+          </w:tcPr>
+          <w:p>
+            <w:r>
+              <w:rPr>
+                <w:b w:val="0"/>
+                <w:sz w:val="18"/>
+              </w:rPr>
+              <w:t>0.704</w:t>
+            </w:r>
+          </w:p>
+        </w:tc>
+        <w:tc>
+          <w:tcPr>
+            <w:tcW w:type="dxa" w:w="1728"/>
+          </w:tcPr>
+          <w:p>
+            <w:r>
+              <w:rPr>
+                <w:b w:val="0"/>
+                <w:sz w:val="18"/>
+              </w:rPr>
+              <w:t>38</w:t>
+            </w:r>
+          </w:p>
+        </w:tc>
+      </w:tr>
+    </w:tbl>
+    <w:p/>
+    <w:p>
+      <w:r>
+        <w:t>各來源測試準確率：smartdog 83.1%（123/148）、gabungan 75.9%（126/166）、litespy 72.5%（29/40）、smoky 57.1%（8/14）；litespy 與 smoky 筆數很少，不穩定。</w:t>
+      </w:r>
+    </w:p>
+    <w:p>
+      <w:r>
+        <w:t>切分歷程與對照（皆為單次訓練，種子 42）：</w:t>
+      </w:r>
+    </w:p>
+    <w:tbl>
+      <w:tblPr>
+        <w:tblStyle w:val="TableGrid"/>
+        <w:tblW w:type="auto" w:w="0"/>
+        <w:tblLook w:firstColumn="1" w:firstRow="1" w:lastColumn="0" w:lastRow="0" w:noHBand="0" w:noVBand="1" w:val="04A0"/>
+      </w:tblPr>
+      <w:tblGrid>
+        <w:gridCol w:w="2160"/>
+        <w:gridCol w:w="2160"/>
+        <w:gridCol w:w="2160"/>
+        <w:gridCol w:w="2160"/>
+      </w:tblGrid>
+      <w:tr>
+        <w:tc>
+          <w:tcPr>
+            <w:tcW w:type="dxa" w:w="2160"/>
+          </w:tcPr>
+          <w:p>
+            <w:r>
+              <w:rPr>
+                <w:b/>
+                <w:sz w:val="18"/>
+              </w:rPr>
+              <w:t>版本</w:t>
+            </w:r>
+          </w:p>
+        </w:tc>
+        <w:tc>
+          <w:tcPr>
+            <w:tcW w:type="dxa" w:w="2160"/>
+          </w:tcPr>
+          <w:p>
+            <w:r>
+              <w:rPr>
+                <w:b/>
+                <w:sz w:val="18"/>
+              </w:rPr>
+              <w:t>切分</w:t>
+            </w:r>
+          </w:p>
+        </w:tc>
+        <w:tc>
+          <w:tcPr>
+            <w:tcW w:type="dxa" w:w="2160"/>
+          </w:tcPr>
+          <w:p>
+            <w:r>
+              <w:rPr>
+                <w:b/>
+                <w:sz w:val="18"/>
+              </w:rPr>
+              <w:t>測試 Accuracy</w:t>
+            </w:r>
+          </w:p>
+        </w:tc>
+        <w:tc>
+          <w:tcPr>
+            <w:tcW w:type="dxa" w:w="2160"/>
+          </w:tcPr>
+          <w:p>
+            <w:r>
+              <w:rPr>
+                <w:b/>
+                <w:sz w:val="18"/>
+              </w:rPr>
+              <w:t>備註</w:t>
+            </w:r>
+          </w:p>
+        </w:tc>
+      </w:tr>
+      <w:tr>
+        <w:tc>
+          <w:tcPr>
+            <w:tcW w:type="dxa" w:w="2160"/>
+          </w:tcPr>
+          <w:p>
+            <w:r>
+              <w:rPr>
+                <w:b w:val="0"/>
+                <w:sz w:val="18"/>
+              </w:rPr>
+              <w:t>舊切分（只比對 0/90/180/270 度）</w:t>
+            </w:r>
+          </w:p>
+        </w:tc>
+        <w:tc>
+          <w:tcPr>
+            <w:tcW w:type="dxa" w:w="2160"/>
+          </w:tcPr>
+          <w:p>
+            <w:r>
+              <w:rPr>
+                <w:b w:val="0"/>
+                <w:sz w:val="18"/>
+              </w:rPr>
+              <w:t>舊</w:t>
+            </w:r>
+          </w:p>
+        </w:tc>
+        <w:tc>
+          <w:tcPr>
+            <w:tcW w:type="dxa" w:w="2160"/>
+          </w:tcPr>
+          <w:p>
+            <w:r>
+              <w:rPr>
+                <w:b w:val="0"/>
+                <w:sz w:val="18"/>
+              </w:rPr>
+              <w:t>80.16%（295/368）</w:t>
+            </w:r>
+          </w:p>
+        </w:tc>
+        <w:tc>
+          <w:tcPr>
+            <w:tcW w:type="dxa" w:w="2160"/>
+          </w:tcPr>
+          <w:p>
+            <w:r>
+              <w:rPr>
+                <w:b w:val="0"/>
+                <w:sz w:val="18"/>
+              </w:rPr>
+              <w:t>稽核發現 62/368（16.8%）測試影像在訓練集有鏡像／小角度旋轉的近重複副本；有近重複者 56/62＝90.3%，無近重複者 239/306＝78.1%</w:t>
+            </w:r>
+          </w:p>
+        </w:tc>
+      </w:tr>
+      <w:tr>
+        <w:tc>
+          <w:tcPr>
+            <w:tcW w:type="dxa" w:w="2160"/>
+          </w:tcPr>
+          <w:p>
+            <w:r>
+              <w:rPr>
+                <w:b w:val="0"/>
+                <w:sz w:val="18"/>
+              </w:rPr>
+              <w:t>新切分，early stopping patience 8</w:t>
+            </w:r>
+          </w:p>
+        </w:tc>
+        <w:tc>
+          <w:tcPr>
+            <w:tcW w:type="dxa" w:w="2160"/>
+          </w:tcPr>
+          <w:p>
+            <w:r>
+              <w:rPr>
+                <w:b w:val="0"/>
+                <w:sz w:val="18"/>
+              </w:rPr>
+              <w:t>新</w:t>
+            </w:r>
+          </w:p>
+        </w:tc>
+        <w:tc>
+          <w:tcPr>
+            <w:tcW w:type="dxa" w:w="2160"/>
+          </w:tcPr>
+          <w:p>
+            <w:r>
+              <w:rPr>
+                <w:b w:val="0"/>
+                <w:sz w:val="18"/>
+              </w:rPr>
+              <w:t>66.30%（244/368）</w:t>
+            </w:r>
+          </w:p>
+        </w:tc>
+        <w:tc>
+          <w:tcPr>
+            <w:tcW w:type="dxa" w:w="2160"/>
+          </w:tcPr>
+          <w:p>
+            <w:r>
+              <w:rPr>
+                <w:b w:val="0"/>
+                <w:sz w:val="18"/>
+              </w:rPr>
+              <w:t>epoch 19 即停止、訓練 Accuracy 約 73%，疑為欠擬合</w:t>
+            </w:r>
+          </w:p>
+        </w:tc>
+      </w:tr>
+      <w:tr>
+        <w:tc>
+          <w:tcPr>
+            <w:tcW w:type="dxa" w:w="2160"/>
+          </w:tcPr>
+          <w:p>
+            <w:r>
+              <w:rPr>
+                <w:b w:val="0"/>
+                <w:sz w:val="18"/>
+              </w:rPr>
+              <w:t>新切分，patience 15（主結果）</w:t>
+            </w:r>
+          </w:p>
+        </w:tc>
+        <w:tc>
+          <w:tcPr>
+            <w:tcW w:type="dxa" w:w="2160"/>
+          </w:tcPr>
+          <w:p>
+            <w:r>
+              <w:rPr>
+                <w:b w:val="0"/>
+                <w:sz w:val="18"/>
+              </w:rPr>
+              <w:t>新</w:t>
+            </w:r>
+          </w:p>
+        </w:tc>
+        <w:tc>
+          <w:tcPr>
+            <w:tcW w:type="dxa" w:w="2160"/>
+          </w:tcPr>
+          <w:p>
+            <w:r>
+              <w:rPr>
+                <w:b w:val="0"/>
+                <w:sz w:val="18"/>
+              </w:rPr>
+              <w:t>77.72%（286/368）</w:t>
+            </w:r>
+          </w:p>
+        </w:tc>
+        <w:tc>
+          <w:tcPr>
+            <w:tcW w:type="dxa" w:w="2160"/>
+          </w:tcPr>
+          <w:p>
+            <w:r>
+              <w:rPr>
+                <w:b w:val="0"/>
+                <w:sz w:val="18"/>
+              </w:rPr>
+              <w:t>放寬 patience 是看到 66.30% 後才決定，依據驗證集而非測試集，但屬於事後調整，應如實揭露</w:t>
+            </w:r>
+          </w:p>
+        </w:tc>
+      </w:tr>
+    </w:tbl>
+    <w:p/>
+    <w:p>
+      <w:r>
+        <w:t>新舊切分的測試集組成不同（例如 litespy 測試筆數 82→40），不能直接逐項比較。</w:t>
+      </w:r>
+    </w:p>
+    <w:p>
+      <w:r>
+        <w:t>B2 對照實驗（舊切分上進行，未在新切分重做）： EfficientNet-B2 @256 搭配較強資料增強，在舊切分上測試 Accuracy 74.73%（275/368）、macro F1 0.7442，低於同切分的 B0（80.16%），故採用 B0。此對照不適用於新切分。</w:t>
+      </w:r>
+    </w:p>
+    <w:p>
+      <w:r>
+        <w:t>誤差分析（舊切分、舊模型時得到的觀察，不保證適用於新模型）：gabungan 準確率最低、小圖與低對比度不是主因、高信心錯誤僅 2/73。新模型的各來源準確率見上表（smartdog 最高）。patience 8 版本曾出現 healthy 大量被判為 hypersensitivity（litespy 佔訓練集 healthy 的 477/773），顯示可能存在來源捷徑，但 patience 15 版本此現象大幅減輕，且未做消融實驗，故不下結論。標註正確性未經獸醫審核。</w:t>
+      </w:r>
+    </w:p>
+    <w:p>
+      <w:r>
+        <w:t>測試集僅 368 筆，單次訓練，未做信賴區間或多種子重複；各類別 38–73 筆，類別層級數字的不確定性大。此結果為研究原型的離線評估，不構成臨床診斷效能。</w:t>
+      </w:r>
+    </w:p>
+    <w:p>
+      <w:r>
+        <w:t>切分稽核：以 pHash／dHash 加 32×32 像素相關比對（含鏡像與 ±3–15° 小角度旋轉），新切分的測試集在訓練集中找到的近重複為 0 筆。但分組所用方法與此稽核方法重疊，這個 0 不是獨立證明；影片影格等其他類型的副本未檢查。</w:t>
+      </w:r>
+    </w:p>
+    <w:p>
+      <w:r>
+        <w:t>Grad-CAM 範例（B0、新切分、測試集）：gradcam_example_B0_ccby.png 為預測正確且熱圖落在發紅皮膚區域的樣本（挑選過，非隨機）；gradcam_counterexample_B0_ccby.png 為預測正確但熱圖偏向右側而非傷口的樣本，Grad-CAM 不能保證標出病灶。</w:t>
+      </w:r>
+    </w:p>
+    <w:p>
+      <w:r>
+        <w:t>部署驗證：App 後端 main.py 於 Docker（python 3.11、torch 2.3.1、torchvision 0.18.1，CPU）載入新切分的 B0 權重，對 368 筆測試影像預測，與專案環境（torch 2.11.0）離線結果比對：Accuracy 同為 286/368，預測類別 0 筆不一致，各類機率最大差 6e-6。</w:t>
+      </w:r>
+    </w:p>
+    <w:p>
+      <w:r>
+        <w:t>---|---|</w:t>
+      </w:r>
+    </w:p>
+    <w:tbl>
+      <w:tblPr>
+        <w:tblStyle w:val="TableGrid"/>
+        <w:tblW w:type="auto" w:w="0"/>
+        <w:tblLook w:firstColumn="1" w:firstRow="1" w:lastColumn="0" w:lastRow="0" w:noHBand="0" w:noVBand="1" w:val="04A0"/>
+      </w:tblPr>
+      <w:tblGrid>
+        <w:gridCol w:w="4320"/>
+        <w:gridCol w:w="4320"/>
+      </w:tblGrid>
+      <w:tr>
+        <w:tc>
+          <w:tcPr>
+            <w:tcW w:type="dxa" w:w="4320"/>
+          </w:tcPr>
+          <w:p>
+            <w:r>
+              <w:rPr>
+                <w:b/>
+                <w:sz w:val="18"/>
+              </w:rPr>
+              <w:t>測試 Accuracy（水平翻轉 TTA）</w:t>
+            </w:r>
+          </w:p>
+        </w:tc>
+        <w:tc>
+          <w:tcPr>
+            <w:tcW w:type="dxa" w:w="4320"/>
+          </w:tcPr>
+          <w:p>
+            <w:r>
+              <w:rPr>
+                <w:b/>
                 <w:sz w:val="18"/>
               </w:rPr>
               <w:t>80.16%（295/368）</w:t>

</xml_diff>

<commit_message>
Correct leakage claims after independent audit; add metrics, smoky version
- External audit of the new split found >=41/368 (11.1%) confirmed copies in
  test (lower bound); our "0 found" only held for the grouping criterion.
  Docs now say the 77.72% may be optimistic and must not be called leak-free.
- Add test_metrics_newsplit.json: macro AUC 0.944, kappa 0.739, bootstrap CIs
  (image-level and 162-group-level), confusion matrix
- Record epoch indexing (0-based) and smoky dataset version (v2 / 0.01)

Co-Authored-By: Claude Sonnet 5.5 <noreply@anthropic.com>
</commit_message>
<xml_diff>
--- a/docs/開源平台佐證文件.docx
+++ b/docs/開源平台佐證文件.docx
@@ -1141,7 +1141,7 @@
                 <w:b w:val="0"/>
                 <w:sz w:val="18"/>
               </w:rPr>
-              <w:t>v2</w:t>
+              <w:t>v2（版本名稱 0.01，2025-03-10 產生；Universe 頁面僅此 1 個公開版本）</w:t>
             </w:r>
           </w:p>
         </w:tc>
@@ -2633,6 +2633,14 @@
         <w:pStyle w:val="ListBullet"/>
       </w:pPr>
       <w:r>
+        <w:t>測試集含至少 3 張標為 mange 的貓照片。</w:t>
+      </w:r>
+    </w:p>
+    <w:p>
+      <w:pPr>
+        <w:pStyle w:val="ListBullet"/>
+      </w:pPr>
+      <w:r>
         <w:t>新切分的巨大群組（見上）使 litespy 與 smoky 的 val/test 筆數很少（litespy 測試 40、smoky 測試 14），來源別準確率不穩定。</w:t>
       </w:r>
     </w:p>
@@ -3083,7 +3091,7 @@
     </w:p>
     <w:p>
       <w:r>
-        <w:t>主模型為 EfficientNet-B0 @224，依驗證 weighted F1 選出 epoch 38，epoch 53 early stopping（patience 15）。</w:t>
+        <w:t>主模型為 EfficientNet-B0 @224，依驗證 weighted F1 選出 epoch 38（從 0 起算，即第 39 個 epoch），epoch 53 early stopping（patience 15；共跑 54 個 epoch）。</w:t>
       </w:r>
     </w:p>
     <w:tbl>
@@ -4117,12 +4125,12 @@
     </w:p>
     <w:p>
       <w:r>
-        <w:t>切分稽核：以 pHash／dHash 加 32×32 像素相關比對（含鏡像與 ±3–15° 小角度旋轉），新切分的測試集在訓練集中找到的近重複為 0 筆。但分組所用方法與此稽核方法重疊，這個 0 不是獨立證明；影片影格等其他類型的副本未檢查。</w:t>
+        <w:t>切分稽核：本專案以 pHash／dHash 加 32×32 像素相關比對（含鏡像與 ±3–15° 小角度旋轉）稽核，新切分找到 0 筆；但此方法與分組所用方法重疊，不是獨立證明。外部以不同方法（旋轉搜尋 −45°~45°、影片影格、同檔名、目視）獨立稽核，新切分測試集仍有 41/368（11.1%，下限）確認副本，另有 37 筆因低對比度無法驗證；4 組確認副本與其訓練集副本標籤不同。因此 77.72% 可能偏樂觀，不可稱為無洩漏。測試集僅分屬 162 個群組，以群組為單位的 Accuracy 95% CI 為 69.3–85.1%（影像層級 73.4–81.8%）；macro AUC（OvR）0.944、κ 0.739。</w:t>
       </w:r>
     </w:p>
     <w:p>
       <w:r>
-        <w:t>Grad-CAM 範例（B0、新切分、測試集）：gradcam_example_B0_ccby.png 為預測正確且熱圖落在發紅皮膚區域的樣本（挑選過，非隨機）；gradcam_counterexample_B0_ccby.png 為預測正確但熱圖偏向右側而非傷口的樣本，Grad-CAM 不能保證標出病灶。</w:t>
+        <w:t>Grad-CAM 範例（B0、新切分、測試集；原圖是否有訓練集副本尚待外部稽核狀態確認）：gradcam_example_B0_ccby.png 為預測正確且熱圖落在發紅皮膚區域的樣本（挑選過，非隨機）；gradcam_counterexample_B0_ccby.png 為預測正確但熱圖偏向右側而非傷口的樣本，Grad-CAM 不能保證標出病灶。</w:t>
       </w:r>
     </w:p>
     <w:p>

</xml_diff>